<commit_message>
lab-setup: run.sh pull-conflict note in the update section
"git pull" on an older ~/PDC-Demo aborts on glossary_generator/run.sh -
a leftover chmod +x from before the repo carried the exec bit, which
git treats as a local edit. The update section now shows the check
(git diff = only the two mode lines) and the fix (checkout -- + pull).
Spliced into the existing docx (Word-COM verified) - the old docx
generator predates the PDC-Scenarios migration and was not used.

Co-Authored-By: Claude Fable 5 <noreply@anthropic.com>
</commit_message>
<xml_diff>
--- a/data_sources/lab/lab-setup.docx
+++ b/data_sources/lab/lab-setup.docx
@@ -1445,6 +1445,35 @@
         </w:rPr>
         <w:t xml:space="preserve">cd glossary_generator &amp;&amp; ./run.sh     # relaunch (Windows: .
 un.ps1)</w:t>
+      </w:r>
+    </w:p>
+    <w:p>
+      <w:r>
+        <w:t xml:space="preserve">If the pull aborts with “local changes to glossary_generator/run.sh would be overwritten”: that is a leftover chmod +x from before the repo carried the exec bit — git treats the mode change as an edit. Check it is only the mode (git diff shows old mode 100644 / new mode 100755), discard it and pull:</w:t>
+      </w:r>
+    </w:p>
+    <w:p>
+      <w:pPr>
+        <w:shd w:val="clear" w:color="auto" w:fill="F2F2F2"/>
+      </w:pPr>
+      <w:r>
+        <w:rPr>
+          <w:rFonts w:ascii="Consolas" w:hAnsi="Consolas"/>
+          <w:sz w:val="20"/>
+        </w:rPr>
+        <w:t xml:space="preserve">git diff glossary_generator/run.sh    # expect only the two mode lines</w:t>
+      </w:r>
+    </w:p>
+    <w:p>
+      <w:pPr>
+        <w:shd w:val="clear" w:color="auto" w:fill="F2F2F2"/>
+      </w:pPr>
+      <w:r>
+        <w:rPr>
+          <w:rFonts w:ascii="Consolas" w:hAnsi="Consolas"/>
+          <w:sz w:val="20"/>
+        </w:rPr>
+        <w:t xml:space="preserve">git checkout -- glossary_generator/run.sh &amp;&amp; git pull</w:t>
       </w:r>
     </w:p>
     <w:p>

</xml_diff>